<commit_message>
Remove add_priority_questions.py and update AMR SI questions documentation with Michiel Vos's comments and unresolved points
</commit_message>
<xml_diff>
--- a/paper/AMR SI first draft.docx
+++ b/paper/AMR SI first draft.docx
@@ -3091,165 +3091,6 @@
       </ns0:r>
       <ns0:r ns0:rsidR="00847CA5">
         <ns0:t xml:space="preserve"> From eminence to evidence based science</ns0:t>
-      </ns0:r>
-    </ns0:p>
-    <ns0:p>
-      <ns0:pPr>
-        <ns0:pStyle ns0:val="Heading1"/>
-        <ns0:pageBreakBefore ns0:val="1"/>
-      </ns0:pPr>
-      <ns0:r>
-        <ns0:t>Questions to answer before submission</ns0:t>
-      </ns0:r>
-    </ns0:p>
-    <ns0:p>
-      <ns0:pPr/>
-      <ns0:r>
-        <ns0:t>Internal working list for completing the first draft. Resolve these in order because later claims depend on the earlier decisions and evidence.</ns0:t>
-      </ns0:r>
-    </ns0:p>
-    <ns0:p>
-      <ns0:pPr/>
-      <ns0:r>
-        <ns0:rPr>
-          <ns0:b/>
-        </ns0:rPr>
-        <ns0:t xml:space="preserve">1. What is the paper’s single primary research question and central claim? </ns0:t>
-      </ns0:r>
-      <ns0:r>
-        <ns0:t>Decide whether AMR-SI is presented as a measure of scientific attention only, a forecasting tool for literature trends, or evidence about emerging resistance itself.</ns0:t>
-      </ns0:r>
-    </ns0:p>
-    <ns0:p>
-      <ns0:pPr/>
-      <ns0:r>
-        <ns0:rPr>
-          <ns0:b/>
-        </ns0:rPr>
-        <ns0:t xml:space="preserve">2. Can the literature-retrieval pipeline be reproduced exactly? </ns0:t>
-      </ns0:r>
-      <ns0:r>
-        <ns0:t>Specify the search date and query logic, synonym lists, pathogen and antibiotic source lists, date range, title/abstract restrictions, deduplication, and every exclusion step.</ns0:t>
-      </ns0:r>
-    </ns0:p>
-    <ns0:p>
-      <ns0:pPr/>
-      <ns0:r>
-        <ns0:rPr>
-          <ns0:b/>
-        </ns0:rPr>
-        <ns0:t xml:space="preserve">3. What is the final dataset used for analysis? </ns0:t>
-      </ns0:r>
-      <ns0:r>
-        <ns0:t>Report the numbers of records retrieved, screened, retained, unique PMIDs, species–antibiotic pairs, years, and exclusions, including the missing placeholders in Results and Figure 1.</ns0:t>
-      </ns0:r>
-    </ns0:p>
-    <ns0:p>
-      <ns0:pPr/>
-      <ns0:r>
-        <ns0:rPr>
-          <ns0:b/>
-        </ns0:rPr>
-        <ns0:t xml:space="preserve">4. How accurate and reproducible is the LLM screening step? </ns0:t>
-      </ns0:r>
-      <ns0:r>
-        <ns0:t>Give the model and run details, prompt, sampling or validation design, error rates, and representative false-positive or false-negative examples, including the proposed ‘bad paper’ example.</ns0:t>
-      </ns0:r>
-    </ns0:p>
-    <ns0:p>
-      <ns0:pPr/>
-      <ns0:r>
-        <ns0:rPr>
-          <ns0:b/>
-        </ns0:rPr>
-        <ns0:t xml:space="preserve">5. Is the AMR-SI model fully specified and internally consistent? </ns0:t>
-      </ns0:r>
-      <ns0:r>
-        <ns0:t>Resolve notation and terminology, the ridge-penalty parameter, zero handling, log-scale versus back-transformed quantities, inclusion thresholds, and the inconsistent references to 2023 and 2025.</ns0:t>
-      </ns0:r>
-    </ns0:p>
-    <ns0:p>
-      <ns0:pPr/>
-      <ns0:r>
-        <ns0:rPr>
-          <ns0:b/>
-        </ns0:rPr>
-        <ns0:t xml:space="preserve">6. Does the temporal model justify the 2030 projections? </ns0:t>
-      </ns0:r>
-      <ns0:r>
-        <ns0:t>Explain the training window, LOESS and fallback rules, boundary-slope extrapolation, validation through 2025, uncertainty bands, and why these are trend projections rather than calibrated epidemiological forecasts.</ns0:t>
-      </ns0:r>
-    </ns0:p>
-    <ns0:p>
-      <ns0:pPr/>
-      <ns0:r>
-        <ns0:rPr>
-          <ns0:b/>
-        </ns0:rPr>
-        <ns0:t xml:space="preserve">7. Which four contrasting examples demonstrate that AMR-SI recapitulates known trends? </ns0:t>
-      </ns0:r>
-      <ns0:r>
-        <ns0:t>Choose examples using an explicit rule, describe the biological and publication trends, and add literature citations that support each interpretation without cherry-picking.</ns0:t>
-      </ns0:r>
-    </ns0:p>
-    <ns0:p>
-      <ns0:pPr/>
-      <ns0:r>
-        <ns0:rPr>
-          <ns0:b/>
-        </ns0:rPr>
-        <ns0:t xml:space="preserve">8. Which pathogen–antibiotic pairs should be prioritised for surveillance in 2030? </ns0:t>
-      </ns0:r>
-      <ns0:r>
-        <ns0:t>State the exact threshold and ranking rule, show the shortlisted pairs and scores, and test whether the shortlist changes under reasonable sensitivity analyses.</ns0:t>
-      </ns0:r>
-    </ns0:p>
-    <ns0:p>
-      <ns0:pPr/>
-      <ns0:r>
-        <ns0:rPr>
-          <ns0:b/>
-        </ns0:rPr>
-        <ns0:t xml:space="preserve">9. How should similarities and discrepancies with the WHO GLASS list be interpreted? </ns0:t>
-      </ns0:r>
-      <ns0:r>
-        <ns0:t>Separate scope and coverage differences from genuine signals, identify plausible additions and false positives, and avoid treating GLASS as a direct gold standard for scientific attention.</ns0:t>
-      </ns0:r>
-    </ns0:p>
-    <ns0:p>
-      <ns0:pPr/>
-      <ns0:r>
-        <ns0:rPr>
-          <ns0:b/>
-        </ns0:rPr>
-        <ns0:t xml:space="preserve">10. What can the method not infer? </ns0:t>
-      </ns0:r>
-      <ns0:r>
-        <ns0:t>State clearly that publication attention is not resistance prevalence, incidence, clinical burden, geography, or transmission; address publication lag, strain-level versus species-level evidence, gene versus phenotype, class-only mentions, and unusual pairs such as vancomycin-resistant E. coli.</ns0:t>
-      </ns0:r>
-    </ns0:p>
-    <ns0:p>
-      <ns0:pPr/>
-      <ns0:r>
-        <ns0:rPr>
-          <ns0:b/>
-        </ns0:rPr>
-        <ns0:t xml:space="preserve">11. Can readers access the materials needed to audit or update the analysis? </ns0:t>
-      </ns0:r>
-      <ns0:r>
-        <ns0:t>Decide what to provide for the code, search queries, synonym tables, prompts, model settings, screened outputs, figures, and tables, subject to licensing and data-governance constraints.</ns0:t>
-      </ns0:r>
-    </ns0:p>
-    <ns0:p>
-      <ns0:pPr/>
-      <ns0:r>
-        <ns0:rPr>
-          <ns0:b/>
-        </ns0:rPr>
-        <ns0:t xml:space="preserve">12. Does the Discussion and Conclusion state the novelty and practical use at the right strength? </ns0:t>
-      </ns0:r>
-      <ns0:r>
-        <ns0:t>Replace placeholders, define how this complements laboratory surveillance, and refine the final message so that ‘from eminence to evidence-based science’ matches the evidence actually presented.</ns0:t>
       </ns0:r>
     </ns0:p>
     <ns0:sectPr ns0:rsidR="00847CA5">

</xml_diff>